<commit_message>
Atualizacao lista de requisitos apos mapa mental
</commit_message>
<xml_diff>
--- a/PastaDocsRequisitos/ListaConsolidadaRequisitosEstacionamento-BRAINSTORM.docx
+++ b/PastaDocsRequisitos/ListaConsolidadaRequisitosEstacionamento-BRAINSTORM.docx
@@ -14,165 +14,371 @@
       <w:r>
         <w:t>BRAINSTORM</w:t>
       </w:r>
-    </w:p>
-    <w:p>
-      <w:r>
-        <w:t>Data: 25/03/2022</w:t>
-      </w:r>
-    </w:p>
-    <w:p>
-      <w:r>
-        <w:t>Sala: 2SIF</w:t>
-      </w:r>
-    </w:p>
-    <w:p/>
-    <w:p>
-      <w:r>
-        <w:t>Requisitos:</w:t>
-      </w:r>
-    </w:p>
-    <w:p>
-      <w:r>
-        <w:t>-Sinalização de vagas livres e ocupadas</w:t>
-      </w:r>
-    </w:p>
-    <w:p>
-      <w:r>
-        <w:t>-Registro de avarias na entrada e saída de veículos</w:t>
-      </w:r>
-    </w:p>
-    <w:p>
-      <w:r>
-        <w:t>-Cadastro de clientes</w:t>
-      </w:r>
-    </w:p>
-    <w:p>
-      <w:r>
-        <w:t>-Registro de entrada de veículo</w:t>
-      </w:r>
-    </w:p>
-    <w:p>
-      <w:r>
-        <w:t>-Configuração de perfis de acesso ao sistema</w:t>
-      </w:r>
-    </w:p>
-    <w:p>
-      <w:r>
-        <w:t>-Controle de preço por tipo de veículo, dia e horário</w:t>
-      </w:r>
-    </w:p>
-    <w:p>
-      <w:r>
-        <w:t>-Terminal de autoatendimento para pagamento</w:t>
-      </w:r>
-    </w:p>
-    <w:p>
-      <w:r>
-        <w:t>-Abertura e fechamento de cancela comando pelo sistema (com sensor de presença de veículo sob a cancela)</w:t>
-      </w:r>
-    </w:p>
-    <w:p>
-      <w:r>
-        <w:t>-Calendário de promoções</w:t>
-      </w:r>
-    </w:p>
-    <w:p>
-      <w:r>
-        <w:t>-Relatório de pagamentos</w:t>
-      </w:r>
-    </w:p>
-    <w:p>
-      <w:r>
-        <w:t>-Informação em tempo real</w:t>
-      </w:r>
-    </w:p>
-    <w:p>
-      <w:r>
-        <w:t>-Controle de rotativos, convênios e mensalistas</w:t>
-      </w:r>
-    </w:p>
-    <w:p>
-      <w:r>
-        <w:t xml:space="preserve">-Relatório analítico e sintético de estatística de permanência </w:t>
-      </w:r>
-    </w:p>
-    <w:p>
-      <w:r>
-        <w:t>-Saída controlada por código de barra</w:t>
-      </w:r>
-    </w:p>
-    <w:p>
-      <w:r>
-        <w:t>-Backup automático de dados</w:t>
-      </w:r>
-    </w:p>
-    <w:p>
-      <w:r>
-        <w:t>-Verificação de vagas livres por app mobile</w:t>
-      </w:r>
-    </w:p>
-    <w:p>
-      <w:r>
-        <w:t>-Controle de execução e cobrança por serviços adicionais (lava-jato)</w:t>
-      </w:r>
-    </w:p>
-    <w:p>
-      <w:r>
-        <w:t xml:space="preserve">-Envio de recibos ao cliente por </w:t>
-      </w:r>
-      <w:proofErr w:type="spellStart"/>
-      <w:r>
-        <w:t>email</w:t>
-      </w:r>
-      <w:proofErr w:type="spellEnd"/>
-    </w:p>
-    <w:p>
-      <w:r>
-        <w:t>-Detecção e registro de placas de automóveis</w:t>
-      </w:r>
-    </w:p>
-    <w:p>
-      <w:r>
-        <w:t>-Emissão de vouchers de desconto</w:t>
-      </w:r>
-    </w:p>
-    <w:p>
-      <w:r>
-        <w:t>-Acesso remoto ao sistema</w:t>
-      </w:r>
-    </w:p>
-    <w:p>
-      <w:r>
-        <w:t>-Controle de pagamento com múltiplos meios (PIX, Crédito, Débito, Espécie)</w:t>
-      </w:r>
-    </w:p>
-    <w:p>
-      <w:pPr>
-        <w:rPr>
-          <w:color w:val="FF0000"/>
-        </w:rPr>
-      </w:pPr>
-      <w:r>
-        <w:rPr>
-          <w:color w:val="FF0000"/>
-        </w:rPr>
-        <w:t>-Cadastramento automático de placa, modelo, marca, tamanho e cor de veículo por reconhecimento ótico</w:t>
-      </w:r>
-    </w:p>
-    <w:p>
-      <w:pPr>
-        <w:rPr>
-          <w:color w:val="FF0000"/>
-        </w:rPr>
-      </w:pPr>
-      <w:r>
-        <w:rPr>
-          <w:color w:val="FF0000"/>
-        </w:rPr>
-        <w:t>-Cadastramento de política de pontuação para descontos</w:t>
-      </w:r>
       <w:bookmarkStart w:id="0" w:name="_GoBack"/>
       <w:bookmarkEnd w:id="0"/>
+    </w:p>
+    <w:p>
+      <w:r>
+        <w:t>Data: 25/03/2022</w:t>
+      </w:r>
+    </w:p>
+    <w:p>
+      <w:r>
+        <w:t>Sala: 2SIF</w:t>
+      </w:r>
+    </w:p>
+    <w:p/>
+    <w:p>
+      <w:pPr>
+        <w:rPr>
+          <w:highlight w:val="yellow"/>
+        </w:rPr>
+      </w:pPr>
+      <w:r>
+        <w:rPr>
+          <w:highlight w:val="yellow"/>
+        </w:rPr>
+        <w:t>Requisitos:</w:t>
+      </w:r>
+    </w:p>
+    <w:p>
+      <w:pPr>
+        <w:rPr>
+          <w:highlight w:val="yellow"/>
+        </w:rPr>
+      </w:pPr>
+      <w:r>
+        <w:rPr>
+          <w:highlight w:val="yellow"/>
+        </w:rPr>
+        <w:t>-Sinalização de vagas livres e ocupadas</w:t>
+      </w:r>
+    </w:p>
+    <w:p>
+      <w:pPr>
+        <w:rPr>
+          <w:highlight w:val="yellow"/>
+        </w:rPr>
+      </w:pPr>
+      <w:r>
+        <w:rPr>
+          <w:highlight w:val="yellow"/>
+        </w:rPr>
+        <w:t>-Registro de avarias na entrada e saída de veículos</w:t>
+      </w:r>
+    </w:p>
+    <w:p>
+      <w:pPr>
+        <w:rPr>
+          <w:highlight w:val="yellow"/>
+        </w:rPr>
+      </w:pPr>
+      <w:r>
+        <w:rPr>
+          <w:highlight w:val="yellow"/>
+        </w:rPr>
+        <w:t>-Cadastro de clientes</w:t>
+      </w:r>
+    </w:p>
+    <w:p>
+      <w:pPr>
+        <w:rPr>
+          <w:highlight w:val="yellow"/>
+        </w:rPr>
+      </w:pPr>
+      <w:r>
+        <w:rPr>
+          <w:highlight w:val="yellow"/>
+        </w:rPr>
+        <w:t>-Registro de entrada de veículo</w:t>
+      </w:r>
+    </w:p>
+    <w:p>
+      <w:pPr>
+        <w:rPr>
+          <w:highlight w:val="yellow"/>
+        </w:rPr>
+      </w:pPr>
+      <w:r>
+        <w:rPr>
+          <w:highlight w:val="yellow"/>
+        </w:rPr>
+        <w:t>-Configuração de perfis de acesso ao sistema</w:t>
+      </w:r>
+    </w:p>
+    <w:p>
+      <w:pPr>
+        <w:rPr>
+          <w:highlight w:val="yellow"/>
+        </w:rPr>
+      </w:pPr>
+      <w:r>
+        <w:rPr>
+          <w:highlight w:val="yellow"/>
+        </w:rPr>
+        <w:t>-Controle de preço por tipo de veículo, dia e horário</w:t>
+      </w:r>
+    </w:p>
+    <w:p>
+      <w:pPr>
+        <w:rPr>
+          <w:highlight w:val="yellow"/>
+        </w:rPr>
+      </w:pPr>
+      <w:r>
+        <w:rPr>
+          <w:highlight w:val="yellow"/>
+        </w:rPr>
+        <w:t>-Terminal de autoatendimento para pagamento</w:t>
+      </w:r>
+    </w:p>
+    <w:p>
+      <w:pPr>
+        <w:rPr>
+          <w:highlight w:val="yellow"/>
+        </w:rPr>
+      </w:pPr>
+      <w:r>
+        <w:rPr>
+          <w:highlight w:val="yellow"/>
+        </w:rPr>
+        <w:t>-Abertura e fechamento de cancela comando pelo sistema (com sensor de presença de veículo sob a cancela)</w:t>
+      </w:r>
+    </w:p>
+    <w:p>
+      <w:pPr>
+        <w:rPr>
+          <w:highlight w:val="yellow"/>
+        </w:rPr>
+      </w:pPr>
+      <w:r>
+        <w:rPr>
+          <w:highlight w:val="yellow"/>
+        </w:rPr>
+        <w:t>-Calendário de promoções</w:t>
+      </w:r>
+    </w:p>
+    <w:p>
+      <w:pPr>
+        <w:rPr>
+          <w:highlight w:val="yellow"/>
+        </w:rPr>
+      </w:pPr>
+      <w:r>
+        <w:rPr>
+          <w:highlight w:val="yellow"/>
+        </w:rPr>
+        <w:t>-Relatório de pagamentos</w:t>
+      </w:r>
+    </w:p>
+    <w:p>
+      <w:pPr>
+        <w:rPr>
+          <w:highlight w:val="yellow"/>
+        </w:rPr>
+      </w:pPr>
+      <w:r>
+        <w:rPr>
+          <w:highlight w:val="yellow"/>
+        </w:rPr>
+        <w:t>-Informação em tempo real</w:t>
+      </w:r>
+    </w:p>
+    <w:p>
+      <w:pPr>
+        <w:rPr>
+          <w:highlight w:val="yellow"/>
+        </w:rPr>
+      </w:pPr>
+      <w:r>
+        <w:rPr>
+          <w:highlight w:val="yellow"/>
+        </w:rPr>
+        <w:t>-Controle de rotativos, convênios e mensalistas</w:t>
+      </w:r>
+    </w:p>
+    <w:p>
+      <w:pPr>
+        <w:rPr>
+          <w:highlight w:val="yellow"/>
+        </w:rPr>
+      </w:pPr>
+      <w:r>
+        <w:rPr>
+          <w:highlight w:val="yellow"/>
+        </w:rPr>
+        <w:t xml:space="preserve">-Relatório analítico e sintético de estatística de permanência </w:t>
+      </w:r>
+    </w:p>
+    <w:p>
+      <w:pPr>
+        <w:rPr>
+          <w:highlight w:val="yellow"/>
+        </w:rPr>
+      </w:pPr>
+      <w:r>
+        <w:rPr>
+          <w:highlight w:val="yellow"/>
+        </w:rPr>
+        <w:t>-Saída controlada por código de barra</w:t>
+      </w:r>
+    </w:p>
+    <w:p>
+      <w:pPr>
+        <w:rPr>
+          <w:highlight w:val="yellow"/>
+        </w:rPr>
+      </w:pPr>
+      <w:r>
+        <w:rPr>
+          <w:highlight w:val="yellow"/>
+        </w:rPr>
+        <w:t>-Backup automático de dados</w:t>
+      </w:r>
+    </w:p>
+    <w:p>
+      <w:pPr>
+        <w:rPr>
+          <w:highlight w:val="yellow"/>
+        </w:rPr>
+      </w:pPr>
+      <w:r>
+        <w:rPr>
+          <w:highlight w:val="yellow"/>
+        </w:rPr>
+        <w:t>-Verificação de vagas livres por app mobile</w:t>
+      </w:r>
+    </w:p>
+    <w:p>
+      <w:pPr>
+        <w:rPr>
+          <w:highlight w:val="yellow"/>
+        </w:rPr>
+      </w:pPr>
+      <w:r>
+        <w:rPr>
+          <w:highlight w:val="yellow"/>
+        </w:rPr>
+        <w:t>-Controle de execução e cobrança por serviços adicionais (lava-jato)</w:t>
+      </w:r>
+    </w:p>
+    <w:p>
+      <w:pPr>
+        <w:rPr>
+          <w:highlight w:val="yellow"/>
+        </w:rPr>
+      </w:pPr>
+      <w:r>
+        <w:rPr>
+          <w:highlight w:val="yellow"/>
+        </w:rPr>
+        <w:t xml:space="preserve">-Envio de recibos ao cliente por </w:t>
+      </w:r>
+      <w:proofErr w:type="spellStart"/>
+      <w:r>
+        <w:rPr>
+          <w:highlight w:val="yellow"/>
+        </w:rPr>
+        <w:t>email</w:t>
+      </w:r>
+      <w:proofErr w:type="spellEnd"/>
+    </w:p>
+    <w:p>
+      <w:pPr>
+        <w:rPr>
+          <w:highlight w:val="yellow"/>
+        </w:rPr>
+      </w:pPr>
+      <w:r>
+        <w:rPr>
+          <w:highlight w:val="yellow"/>
+        </w:rPr>
+        <w:t>-Detecção e registro de placas de automóveis</w:t>
+      </w:r>
+    </w:p>
+    <w:p>
+      <w:pPr>
+        <w:rPr>
+          <w:highlight w:val="yellow"/>
+        </w:rPr>
+      </w:pPr>
+      <w:r>
+        <w:rPr>
+          <w:highlight w:val="yellow"/>
+        </w:rPr>
+        <w:t>-Emissão de vouchers de desconto</w:t>
+      </w:r>
+    </w:p>
+    <w:p>
+      <w:pPr>
+        <w:rPr>
+          <w:highlight w:val="yellow"/>
+        </w:rPr>
+      </w:pPr>
+      <w:r>
+        <w:rPr>
+          <w:highlight w:val="yellow"/>
+        </w:rPr>
+        <w:t>-Acesso remoto ao sistema</w:t>
+      </w:r>
+    </w:p>
+    <w:p>
+      <w:pPr>
+        <w:rPr>
+          <w:highlight w:val="yellow"/>
+        </w:rPr>
+      </w:pPr>
+      <w:r>
+        <w:rPr>
+          <w:highlight w:val="yellow"/>
+        </w:rPr>
+        <w:t>-Controle de pagamento com múltiplos meios (PIX, Crédito, Débito, Espécie)</w:t>
+      </w:r>
+    </w:p>
+    <w:p>
+      <w:pPr>
+        <w:rPr>
+          <w:color w:val="FF0000"/>
+          <w:highlight w:val="yellow"/>
+        </w:rPr>
+      </w:pPr>
+      <w:r>
+        <w:rPr>
+          <w:color w:val="FF0000"/>
+          <w:highlight w:val="yellow"/>
+        </w:rPr>
+        <w:t>-Cadastramento automático de placa, modelo, marca, tamanho e cor de veículo por reconhecimento ótico</w:t>
+      </w:r>
+    </w:p>
+    <w:p>
+      <w:pPr>
+        <w:rPr>
+          <w:color w:val="FF0000"/>
+          <w:highlight w:val="yellow"/>
+        </w:rPr>
+      </w:pPr>
+      <w:r>
+        <w:rPr>
+          <w:color w:val="FF0000"/>
+          <w:highlight w:val="yellow"/>
+        </w:rPr>
+        <w:t>-Cadastramento de política de pontuação para descontos</w:t>
+      </w:r>
+    </w:p>
+    <w:p>
+      <w:pPr>
+        <w:rPr>
+          <w:color w:val="FF0000"/>
+        </w:rPr>
+      </w:pPr>
+      <w:r>
+        <w:rPr>
+          <w:color w:val="FF0000"/>
+          <w:highlight w:val="yellow"/>
+        </w:rPr>
+        <w:lastRenderedPageBreak/>
+        <w:t>-Emissão do ticket de estacionamento</w:t>
+      </w:r>
     </w:p>
     <w:sectPr>
       <w:pgSz w:w="11906" w:h="16838"/>

</xml_diff>